<commit_message>
Organiza las fases del informe segun la guia y enlaza sus ramas
</commit_message>
<xml_diff>
--- a/fase_b/Informe_SAST_DAST.docx
+++ b/fase_b/Informe_SAST_DAST.docx
@@ -3156,6 +3156,34 @@
     </w:p>
     <w:p>
       <w:pPr>
+        <w:keepNext/>
+      </w:pPr>
+      <w:r>
+        <w:rPr>
+          <w:rFonts w:ascii="Times New Roman" w:hAnsi="Times New Roman"/>
+          <w:b/>
+          <w:color w:val="000000"/>
+          <w:sz w:val="24"/>
+        </w:rPr>
+        <w:t>1 Inicialización</w:t>
+      </w:r>
+    </w:p>
+    <w:p>
+      <w:pPr>
+        <w:pageBreakBefore w:val="0"/>
+        <w:spacing w:after="140" w:line="252" w:lineRule="auto"/>
+      </w:pPr>
+      <w:r>
+        <w:rPr>
+          <w:rFonts w:ascii="Times New Roman" w:hAnsi="Times New Roman"/>
+          <w:color w:val="000000"/>
+          <w:sz w:val="23"/>
+        </w:rPr>
+        <w:t>Se utilizó el contenedor local de SonarQube en http://127.0.0.1:9000 y se crearon tres proyectos: original del docente, ejemplo vulnerable y ejemplo corregido.</w:t>
+      </w:r>
+    </w:p>
+    <w:p>
+      <w:pPr>
         <w:pageBreakBefore w:val="0"/>
         <w:spacing w:after="140" w:line="252" w:lineRule="auto"/>
       </w:pPr>
@@ -3166,12 +3194,27 @@
           <w:color w:val="000000"/>
           <w:sz w:val="23"/>
         </w:rPr>
-        <w:t>Se utilizó SonarQube local en http://127.0.0.1:9000. El análisis del código se realizó sin iniciar Flask; después se comprobaron las correcciones con cuatro pruebas funcionales.</w:t>
-      </w:r>
-    </w:p>
-    <w:p>
-      <w:pPr>
-        <w:pageBreakBefore w:val="0"/>
+        <w:t>El original del docente registra clientes en CSV y no incluye SQL ni contraseñas. Los casos 1 y 3 se probaron en el ejemplo de autenticación del informe del equipo. Su aceptación como código de la práctica debe confirmarse con el docente.</w:t>
+      </w:r>
+    </w:p>
+    <w:p>
+      <w:pPr>
+        <w:keepNext/>
+        <w:spacing w:after="140" w:line="252" w:lineRule="auto"/>
+      </w:pPr>
+      <w:r>
+        <w:rPr>
+          <w:rFonts w:ascii="Times New Roman" w:hAnsi="Times New Roman"/>
+          <w:b/>
+          <w:color w:val="000000"/>
+          <w:sz w:val="24"/>
+        </w:rPr>
+        <w:t>2 Ejecución</w:t>
+      </w:r>
+    </w:p>
+    <w:p>
+      <w:pPr>
+        <w:keepNext w:val="0"/>
         <w:spacing w:after="140" w:line="252" w:lineRule="auto"/>
       </w:pPr>
       <w:r>
@@ -3181,7 +3224,7 @@
           <w:color w:val="000000"/>
           <w:sz w:val="23"/>
         </w:rPr>
-        <w:t>El original del docente registra clientes en CSV y no incluye SQL ni contraseñas. Los casos 1 y 3 se probaron en el ejemplo de autenticación del informe del equipo. Su aceptación como código de la práctica debe confirmarse con el docente.</w:t>
+        <w:t>Se limitó cada análisis al archivo indicado, excluyendo entornos virtuales y evidencias. SonarScanner cargó las fuentes y los informes de Bandit mediante sonar.python.bandit.reportPaths, sin ejecutar Flask. Se exportaron los resultados JSON desde SonarQube.</w:t>
       </w:r>
     </w:p>
     <w:tbl>
@@ -3517,9 +3560,9 @@
           <w:rFonts w:ascii="Times New Roman" w:hAnsi="Times New Roman"/>
           <w:b/>
           <w:color w:val="000000"/>
-          <w:sz w:val="26"/>
-        </w:rPr>
-        <w:t>Corrección y comprobación</w:t>
+          <w:sz w:val="24"/>
+        </w:rPr>
+        <w:t>3 Resolución</w:t>
       </w:r>
     </w:p>
     <w:p>
@@ -3749,6 +3792,46 @@
     </w:p>
     <w:p>
       <w:pPr>
+        <w:keepNext w:val="0"/>
+        <w:spacing w:after="140" w:line="252" w:lineRule="auto"/>
+      </w:pPr>
+      <w:r>
+        <w:rPr>
+          <w:rFonts w:ascii="Times New Roman" w:hAnsi="Times New Roman"/>
+          <w:b w:val="0"/>
+          <w:color w:val="000000"/>
+          <w:sz w:val="22"/>
+        </w:rPr>
+        <w:t>Conclusión. La consulta parametrizada y bcrypt corrigieron los fallos del ejemplo. Para prevenir su reaparición, mantener las credenciales fuera del código y repetir el análisis estático y las pruebas de acceso al modificar la autenticación.</w:t>
+      </w:r>
+    </w:p>
+    <w:p>
+      <w:pPr>
+        <w:keepNext w:val="0"/>
+        <w:spacing w:after="140" w:line="252" w:lineRule="auto"/>
+      </w:pPr>
+      <w:r>
+        <w:rPr>
+          <w:rFonts w:ascii="Times New Roman" w:hAnsi="Times New Roman"/>
+          <w:b w:val="0"/>
+          <w:color w:val="000000"/>
+          <w:sz w:val="21"/>
+        </w:rPr>
+        <w:t xml:space="preserve">Rama de trabajo: </w:t>
+      </w:r>
+      <w:hyperlink r:id="rId33">
+        <w:r>
+          <w:rPr>
+            <w:color w:val="0563C1"/>
+            <w:rFonts w:ascii="Times New Roman" w:hAnsi="Times New Roman"/>
+            <w:sz w:val="21"/>
+          </w:rPr>
+          <w:t>https://github.com/sebasbv11/actividad-1-flask-original-docente/tree/sonarqube</w:t>
+        </w:r>
+      </w:hyperlink>
+    </w:p>
+    <w:p>
+      <w:pPr>
         <w:keepNext/>
         <w:pageBreakBefore/>
         <w:spacing w:after="140" w:line="252" w:lineRule="auto"/>
@@ -3765,6 +3848,35 @@
     </w:p>
     <w:p>
       <w:pPr>
+        <w:keepNext/>
+        <w:spacing w:after="140" w:line="252" w:lineRule="auto"/>
+      </w:pPr>
+      <w:r>
+        <w:rPr>
+          <w:rFonts w:ascii="Times New Roman" w:hAnsi="Times New Roman"/>
+          <w:b/>
+          <w:color w:val="000000"/>
+          <w:sz w:val="24"/>
+        </w:rPr>
+        <w:t>1 Despliegue</w:t>
+      </w:r>
+    </w:p>
+    <w:p>
+      <w:pPr>
+        <w:pageBreakBefore w:val="0"/>
+        <w:spacing w:after="140" w:line="252" w:lineRule="auto"/>
+      </w:pPr>
+      <w:r>
+        <w:rPr>
+          <w:rFonts w:ascii="Times New Roman" w:hAnsi="Times New Roman"/>
+          <w:color w:val="000000"/>
+          <w:sz w:val="23"/>
+        </w:rPr>
+        <w:t>Se inició Flask localmente en 127.0.0.1:5011. El contenedor de OWASP ZAP accedió al servidor de pruebas mediante http://host.docker.internal:5011/. Se usaron datos sintéticos y el depurador permaneció desactivado.</w:t>
+      </w:r>
+    </w:p>
+    <w:p>
+      <w:pPr>
         <w:pageBreakBefore w:val="0"/>
         <w:spacing w:after="140" w:line="252" w:lineRule="auto"/>
       </w:pPr>
@@ -3775,12 +3887,27 @@
           <w:color w:val="000000"/>
           <w:sz w:val="23"/>
         </w:rPr>
-        <w:t>Se ejecutó OWASP ZAP 2.17.0 en Docker contra http://host.docker.internal:5011/. Se usó zap-full-scan.py con rastreo y escaneo activo, primero sobre la variante vulnerable y después sobre la corregida.</w:t>
-      </w:r>
-    </w:p>
-    <w:p>
-      <w:pPr>
-        <w:pageBreakBefore w:val="0"/>
+        <w:t>Los formularios de comentarios y edad se añadieron como laboratorio de los casos 4 y 2. Son escenarios complementarios: no pertenecen al código original del docente, que se conserva sin cambios.</w:t>
+      </w:r>
+    </w:p>
+    <w:p>
+      <w:pPr>
+        <w:keepNext/>
+        <w:spacing w:after="140" w:line="252" w:lineRule="auto"/>
+      </w:pPr>
+      <w:r>
+        <w:rPr>
+          <w:rFonts w:ascii="Times New Roman" w:hAnsi="Times New Roman"/>
+          <w:b/>
+          <w:color w:val="000000"/>
+          <w:sz w:val="24"/>
+        </w:rPr>
+        <w:t>2 Ejecución</w:t>
+      </w:r>
+    </w:p>
+    <w:p>
+      <w:pPr>
+        <w:keepNext w:val="0"/>
         <w:spacing w:after="140" w:line="252" w:lineRule="auto"/>
       </w:pPr>
       <w:r>
@@ -3790,7 +3917,7 @@
           <w:color w:val="000000"/>
           <w:sz w:val="23"/>
         </w:rPr>
-        <w:t>Los formularios de comentarios y edad se añadieron como laboratorio de los casos 4 y 2. Son escenarios complementarios: no pertenecen al código original del docente, que se conserva sin cambios.</w:t>
+        <w:t>Se ejecutó ZAP 2.17.0 con zap-full-scan.py: rastreo de formularios y escaneo activo sobre las variantes vulnerable y corregida. Se conservaron los reportes HTML y JSON y las respuestas HTTP de las pruebas.</w:t>
       </w:r>
     </w:p>
     <w:tbl>
@@ -4115,9 +4242,9 @@
           <w:rFonts w:ascii="Times New Roman" w:hAnsi="Times New Roman"/>
           <w:b/>
           <w:color w:val="000000"/>
-          <w:sz w:val="26"/>
-        </w:rPr>
-        <w:t>Simulación y mitigación</w:t>
+          <w:sz w:val="24"/>
+        </w:rPr>
+        <w:t>3 Simulación</w:t>
       </w:r>
     </w:p>
     <w:p>
@@ -4477,29 +4604,36 @@
       <w:r>
         <w:rPr>
           <w:rFonts w:ascii="Times New Roman" w:hAnsi="Times New Roman"/>
+          <w:color w:val="000000"/>
+          <w:sz w:val="23"/>
+        </w:rPr>
+        <w:t>Conclusión. El escape de salida y el manejo genérico de errores corrigieron los vectores ensayados. Para evitar regresiones, conservar el escape automático, validar las entradas y probar que las respuestas no revelen trazas. Los avisos restantes requieren revisión; el reescaneo no acredita la seguridad de toda la aplicación.</w:t>
+      </w:r>
+    </w:p>
+    <w:p>
+      <w:pPr>
+        <w:keepNext w:val="0"/>
+        <w:spacing w:after="140" w:line="252" w:lineRule="auto"/>
+      </w:pPr>
+      <w:r>
+        <w:rPr>
+          <w:rFonts w:ascii="Times New Roman" w:hAnsi="Times New Roman"/>
           <w:b w:val="0"/>
           <w:color w:val="000000"/>
           <w:sz w:val="21"/>
         </w:rPr>
-        <w:t>Repositorio: https://github.com/sebasbv11/actividad-1-flask-original-docente</w:t>
-        <w:br/>
-        <w:t>Ramas de trabajo: sonarqube y owasp-zap.</w:t>
-      </w:r>
-    </w:p>
-    <w:p>
-      <w:pPr>
-        <w:pageBreakBefore w:val="0"/>
-        <w:spacing w:after="140" w:line="252" w:lineRule="auto"/>
-      </w:pPr>
-      <w:r>
-        <w:rPr>
-          <w:rFonts w:ascii="Times New Roman" w:hAnsi="Times New Roman"/>
-          <w:b w:val="0"/>
-          <w:color w:val="000000"/>
-          <w:sz w:val="22"/>
-        </w:rPr>
-        <w:t>Conclusión. Las consultas parametrizadas, los hashes de contraseñas, el escape de salida y el manejo genérico de errores corrigieron los fallos ensayados. Los avisos restantes requieren revisión; estos resultados no acreditan la seguridad de toda la aplicación.</w:t>
-      </w:r>
+        <w:t xml:space="preserve">Rama de trabajo: </w:t>
+      </w:r>
+      <w:hyperlink r:id="rId34">
+        <w:r>
+          <w:rPr>
+            <w:color w:val="0563C1"/>
+            <w:rFonts w:ascii="Times New Roman" w:hAnsi="Times New Roman"/>
+            <w:sz w:val="21"/>
+          </w:rPr>
+          <w:t>https://github.com/sebasbv11/actividad-1-flask-original-docente/tree/owasp-zap</w:t>
+        </w:r>
+      </w:hyperlink>
     </w:p>
     <w:sectPr>
       <w:headerReference w:type="default" r:id="rId20"/>

</xml_diff>